<commit_message>
Anadir calendario de pagos al plan economico-financiero (importes reales, fechas y estado pendientes)
</commit_message>
<xml_diff>
--- a/entregables/LEGION_plan_economico_financiero_v1.docx
+++ b/entregables/LEGION_plan_economico_financiero_v1.docx
@@ -1028,7 +1028,717 @@
           <w:color w:val="12325A"/>
           <w:sz w:val="26"/>
         </w:rPr>
-        <w:t>4. Instalaciones y plan de explotación</w:t>
+        <w:t>4. Calendario de pagos</w:t>
+      </w:r>
+    </w:p>
+    <w:p>
+      <w:pPr>
+        <w:spacing w:after="80"/>
+      </w:pPr>
+      <w:r>
+        <w:rPr>
+          <w:i w:val="0"/>
+          <w:color w:val="3A4260"/>
+          <w:sz w:val="21"/>
+        </w:rPr>
+        <w:t>Aunque parte de los presupuestos está aún en negociación, esta es una estimación aproximada de importes y plazos, que permite valorar si los 310.000 € deben entrar de una vez o por tramos.</w:t>
+      </w:r>
+    </w:p>
+    <w:tbl>
+      <w:tblPr>
+        <w:tblW w:type="auto" w:w="0"/>
+        <w:jc w:val="center"/>
+        <w:tblLook w:firstColumn="1" w:firstRow="1" w:lastColumn="0" w:lastRow="0" w:noHBand="0" w:noVBand="1" w:val="04A0"/>
+        <w:tblBorders>
+          <w:top w:val="single" w:sz="4" w:space="0" w:color="D2D6E4"/>
+          <w:left w:val="single" w:sz="4" w:space="0" w:color="D2D6E4"/>
+          <w:bottom w:val="single" w:sz="4" w:space="0" w:color="D2D6E4"/>
+          <w:right w:val="single" w:sz="4" w:space="0" w:color="D2D6E4"/>
+          <w:insideH w:val="single" w:sz="4" w:space="0" w:color="D2D6E4"/>
+          <w:insideV w:val="single" w:sz="4" w:space="0" w:color="D2D6E4"/>
+        </w:tblBorders>
+      </w:tblPr>
+      <w:tblGrid>
+        <w:gridCol w:w="2436"/>
+        <w:gridCol w:w="2436"/>
+        <w:gridCol w:w="2436"/>
+        <w:gridCol w:w="2436"/>
+      </w:tblGrid>
+      <w:tr>
+        <w:tc>
+          <w:tcPr>
+            <w:tcW w:type="dxa" w:w="3402"/>
+            <w:shd w:val="clear" w:fill="12325A"/>
+          </w:tcPr>
+          <w:p>
+            <w:r>
+              <w:rPr>
+                <w:b/>
+                <w:color w:val="FFFFFF"/>
+                <w:sz w:val="18"/>
+              </w:rPr>
+              <w:t>Concepto</w:t>
+            </w:r>
+          </w:p>
+        </w:tc>
+        <w:tc>
+          <w:tcPr>
+            <w:tcW w:type="dxa" w:w="1531"/>
+            <w:shd w:val="clear" w:fill="12325A"/>
+          </w:tcPr>
+          <w:p>
+            <w:r>
+              <w:rPr>
+                <w:b/>
+                <w:color w:val="FFFFFF"/>
+                <w:sz w:val="18"/>
+              </w:rPr>
+              <w:t>Importe</w:t>
+            </w:r>
+          </w:p>
+        </w:tc>
+        <w:tc>
+          <w:tcPr>
+            <w:tcW w:type="dxa" w:w="1701"/>
+            <w:shd w:val="clear" w:fill="12325A"/>
+          </w:tcPr>
+          <w:p>
+            <w:r>
+              <w:rPr>
+                <w:b/>
+                <w:color w:val="FFFFFF"/>
+                <w:sz w:val="18"/>
+              </w:rPr>
+              <w:t>Fecha aproximada</w:t>
+            </w:r>
+          </w:p>
+        </w:tc>
+        <w:tc>
+          <w:tcPr>
+            <w:tcW w:type="dxa" w:w="1644"/>
+            <w:shd w:val="clear" w:fill="12325A"/>
+          </w:tcPr>
+          <w:p>
+            <w:r>
+              <w:rPr>
+                <w:b/>
+                <w:color w:val="FFFFFF"/>
+                <w:sz w:val="18"/>
+              </w:rPr>
+              <w:t>Estado</w:t>
+            </w:r>
+          </w:p>
+        </w:tc>
+      </w:tr>
+      <w:tr>
+        <w:tc>
+          <w:tcPr>
+            <w:tcW w:type="dxa" w:w="3402"/>
+          </w:tcPr>
+          <w:p>
+            <w:r>
+              <w:rPr>
+                <w:color w:val="3A4260"/>
+                <w:sz w:val="19"/>
+              </w:rPr>
+              <w:t>Obra (tabiques, pintura, techo RF)</w:t>
+            </w:r>
+          </w:p>
+        </w:tc>
+        <w:tc>
+          <w:tcPr>
+            <w:tcW w:type="dxa" w:w="1531"/>
+          </w:tcPr>
+          <w:p>
+            <w:r>
+              <w:rPr>
+                <w:color w:val="3A4260"/>
+                <w:sz w:val="19"/>
+              </w:rPr>
+              <w:t>30.368 €</w:t>
+            </w:r>
+          </w:p>
+        </w:tc>
+        <w:tc>
+          <w:tcPr>
+            <w:tcW w:type="dxa" w:w="1701"/>
+          </w:tcPr>
+          <w:p>
+            <w:r>
+              <w:rPr>
+                <w:color w:val="3A4260"/>
+                <w:sz w:val="19"/>
+              </w:rPr>
+              <w:t>A confirmar</w:t>
+            </w:r>
+          </w:p>
+        </w:tc>
+        <w:tc>
+          <w:tcPr>
+            <w:tcW w:type="dxa" w:w="1644"/>
+          </w:tcPr>
+          <w:p>
+            <w:r>
+              <w:rPr>
+                <w:color w:val="3A4260"/>
+                <w:sz w:val="19"/>
+              </w:rPr>
+              <w:t>A confirmar</w:t>
+            </w:r>
+          </w:p>
+        </w:tc>
+      </w:tr>
+      <w:tr>
+        <w:tc>
+          <w:tcPr>
+            <w:tcW w:type="dxa" w:w="3402"/>
+          </w:tcPr>
+          <w:p>
+            <w:r>
+              <w:rPr>
+                <w:color w:val="3A4260"/>
+                <w:sz w:val="19"/>
+              </w:rPr>
+              <w:t>Climatización (Carulla)</w:t>
+            </w:r>
+          </w:p>
+        </w:tc>
+        <w:tc>
+          <w:tcPr>
+            <w:tcW w:type="dxa" w:w="1531"/>
+          </w:tcPr>
+          <w:p>
+            <w:r>
+              <w:rPr>
+                <w:color w:val="3A4260"/>
+                <w:sz w:val="19"/>
+              </w:rPr>
+              <w:t>77.740 €</w:t>
+            </w:r>
+          </w:p>
+        </w:tc>
+        <w:tc>
+          <w:tcPr>
+            <w:tcW w:type="dxa" w:w="1701"/>
+          </w:tcPr>
+          <w:p>
+            <w:r>
+              <w:rPr>
+                <w:color w:val="3A4260"/>
+                <w:sz w:val="19"/>
+              </w:rPr>
+              <w:t>A confirmar</w:t>
+            </w:r>
+          </w:p>
+        </w:tc>
+        <w:tc>
+          <w:tcPr>
+            <w:tcW w:type="dxa" w:w="1644"/>
+          </w:tcPr>
+          <w:p>
+            <w:r>
+              <w:rPr>
+                <w:color w:val="3A4260"/>
+                <w:sz w:val="19"/>
+              </w:rPr>
+              <w:t>A confirmar</w:t>
+            </w:r>
+          </w:p>
+        </w:tc>
+      </w:tr>
+      <w:tr>
+        <w:tc>
+          <w:tcPr>
+            <w:tcW w:type="dxa" w:w="3402"/>
+          </w:tcPr>
+          <w:p>
+            <w:r>
+              <w:rPr>
+                <w:color w:val="3A4260"/>
+                <w:sz w:val="19"/>
+              </w:rPr>
+              <w:t>Vestuarios (taquillas, cabinas, material)</w:t>
+            </w:r>
+          </w:p>
+        </w:tc>
+        <w:tc>
+          <w:tcPr>
+            <w:tcW w:type="dxa" w:w="1531"/>
+          </w:tcPr>
+          <w:p>
+            <w:r>
+              <w:rPr>
+                <w:color w:val="3A4260"/>
+                <w:sz w:val="19"/>
+              </w:rPr>
+              <w:t>39.664 €</w:t>
+            </w:r>
+          </w:p>
+        </w:tc>
+        <w:tc>
+          <w:tcPr>
+            <w:tcW w:type="dxa" w:w="1701"/>
+          </w:tcPr>
+          <w:p>
+            <w:r>
+              <w:rPr>
+                <w:color w:val="3A4260"/>
+                <w:sz w:val="19"/>
+              </w:rPr>
+              <w:t>A confirmar</w:t>
+            </w:r>
+          </w:p>
+        </w:tc>
+        <w:tc>
+          <w:tcPr>
+            <w:tcW w:type="dxa" w:w="1644"/>
+          </w:tcPr>
+          <w:p>
+            <w:r>
+              <w:rPr>
+                <w:color w:val="3A4260"/>
+                <w:sz w:val="19"/>
+              </w:rPr>
+              <w:t>A confirmar</w:t>
+            </w:r>
+          </w:p>
+        </w:tc>
+      </w:tr>
+      <w:tr>
+        <w:tc>
+          <w:tcPr>
+            <w:tcW w:type="dxa" w:w="3402"/>
+          </w:tcPr>
+          <w:p>
+            <w:r>
+              <w:rPr>
+                <w:color w:val="3A4260"/>
+                <w:sz w:val="19"/>
+              </w:rPr>
+              <w:t>Electricidad</w:t>
+            </w:r>
+          </w:p>
+        </w:tc>
+        <w:tc>
+          <w:tcPr>
+            <w:tcW w:type="dxa" w:w="1531"/>
+          </w:tcPr>
+          <w:p>
+            <w:r>
+              <w:rPr>
+                <w:color w:val="3A4260"/>
+                <w:sz w:val="19"/>
+              </w:rPr>
+              <w:t>36.233 €</w:t>
+            </w:r>
+          </w:p>
+        </w:tc>
+        <w:tc>
+          <w:tcPr>
+            <w:tcW w:type="dxa" w:w="1701"/>
+          </w:tcPr>
+          <w:p>
+            <w:r>
+              <w:rPr>
+                <w:color w:val="3A4260"/>
+                <w:sz w:val="19"/>
+              </w:rPr>
+              <w:t>A confirmar</w:t>
+            </w:r>
+          </w:p>
+        </w:tc>
+        <w:tc>
+          <w:tcPr>
+            <w:tcW w:type="dxa" w:w="1644"/>
+          </w:tcPr>
+          <w:p>
+            <w:r>
+              <w:rPr>
+                <w:color w:val="3A4260"/>
+                <w:sz w:val="19"/>
+              </w:rPr>
+              <w:t>A confirmar</w:t>
+            </w:r>
+          </w:p>
+        </w:tc>
+      </w:tr>
+      <w:tr>
+        <w:tc>
+          <w:tcPr>
+            <w:tcW w:type="dxa" w:w="3402"/>
+          </w:tcPr>
+          <w:p>
+            <w:r>
+              <w:rPr>
+                <w:color w:val="3A4260"/>
+                <w:sz w:val="19"/>
+              </w:rPr>
+              <w:t>Detección de incendios</w:t>
+            </w:r>
+          </w:p>
+        </w:tc>
+        <w:tc>
+          <w:tcPr>
+            <w:tcW w:type="dxa" w:w="1531"/>
+          </w:tcPr>
+          <w:p>
+            <w:r>
+              <w:rPr>
+                <w:color w:val="3A4260"/>
+                <w:sz w:val="19"/>
+              </w:rPr>
+              <w:t>11.630 €</w:t>
+            </w:r>
+          </w:p>
+        </w:tc>
+        <w:tc>
+          <w:tcPr>
+            <w:tcW w:type="dxa" w:w="1701"/>
+          </w:tcPr>
+          <w:p>
+            <w:r>
+              <w:rPr>
+                <w:color w:val="3A4260"/>
+                <w:sz w:val="19"/>
+              </w:rPr>
+              <w:t>A confirmar</w:t>
+            </w:r>
+          </w:p>
+        </w:tc>
+        <w:tc>
+          <w:tcPr>
+            <w:tcW w:type="dxa" w:w="1644"/>
+          </w:tcPr>
+          <w:p>
+            <w:r>
+              <w:rPr>
+                <w:color w:val="3A4260"/>
+                <w:sz w:val="19"/>
+              </w:rPr>
+              <w:t>A confirmar</w:t>
+            </w:r>
+          </w:p>
+        </w:tc>
+      </w:tr>
+      <w:tr>
+        <w:tc>
+          <w:tcPr>
+            <w:tcW w:type="dxa" w:w="3402"/>
+          </w:tcPr>
+          <w:p>
+            <w:r>
+              <w:rPr>
+                <w:color w:val="3A4260"/>
+                <w:sz w:val="19"/>
+              </w:rPr>
+              <w:t>Suelo</w:t>
+            </w:r>
+          </w:p>
+        </w:tc>
+        <w:tc>
+          <w:tcPr>
+            <w:tcW w:type="dxa" w:w="1531"/>
+          </w:tcPr>
+          <w:p>
+            <w:r>
+              <w:rPr>
+                <w:color w:val="3A4260"/>
+                <w:sz w:val="19"/>
+              </w:rPr>
+              <w:t>20.570 €</w:t>
+            </w:r>
+          </w:p>
+        </w:tc>
+        <w:tc>
+          <w:tcPr>
+            <w:tcW w:type="dxa" w:w="1701"/>
+          </w:tcPr>
+          <w:p>
+            <w:r>
+              <w:rPr>
+                <w:color w:val="3A4260"/>
+                <w:sz w:val="19"/>
+              </w:rPr>
+              <w:t>A confirmar</w:t>
+            </w:r>
+          </w:p>
+        </w:tc>
+        <w:tc>
+          <w:tcPr>
+            <w:tcW w:type="dxa" w:w="1644"/>
+          </w:tcPr>
+          <w:p>
+            <w:r>
+              <w:rPr>
+                <w:color w:val="3A4260"/>
+                <w:sz w:val="19"/>
+              </w:rPr>
+              <w:t>A confirmar</w:t>
+            </w:r>
+          </w:p>
+        </w:tc>
+      </w:tr>
+      <w:tr>
+        <w:tc>
+          <w:tcPr>
+            <w:tcW w:type="dxa" w:w="3402"/>
+          </w:tcPr>
+          <w:p>
+            <w:r>
+              <w:rPr>
+                <w:color w:val="3A4260"/>
+                <w:sz w:val="19"/>
+              </w:rPr>
+              <w:t>Accesos / QR / tornos (+ elevador, rótulos)</w:t>
+            </w:r>
+          </w:p>
+        </w:tc>
+        <w:tc>
+          <w:tcPr>
+            <w:tcW w:type="dxa" w:w="1531"/>
+          </w:tcPr>
+          <w:p>
+            <w:r>
+              <w:rPr>
+                <w:color w:val="3A4260"/>
+                <w:sz w:val="19"/>
+              </w:rPr>
+              <w:t>43.725 €</w:t>
+            </w:r>
+          </w:p>
+        </w:tc>
+        <w:tc>
+          <w:tcPr>
+            <w:tcW w:type="dxa" w:w="1701"/>
+          </w:tcPr>
+          <w:p>
+            <w:r>
+              <w:rPr>
+                <w:color w:val="3A4260"/>
+                <w:sz w:val="19"/>
+              </w:rPr>
+              <w:t>A confirmar</w:t>
+            </w:r>
+          </w:p>
+        </w:tc>
+        <w:tc>
+          <w:tcPr>
+            <w:tcW w:type="dxa" w:w="1644"/>
+          </w:tcPr>
+          <w:p>
+            <w:r>
+              <w:rPr>
+                <w:color w:val="3A4260"/>
+                <w:sz w:val="19"/>
+              </w:rPr>
+              <w:t>A confirmar</w:t>
+            </w:r>
+          </w:p>
+        </w:tc>
+      </w:tr>
+      <w:tr>
+        <w:tc>
+          <w:tcPr>
+            <w:tcW w:type="dxa" w:w="3402"/>
+          </w:tcPr>
+          <w:p>
+            <w:r>
+              <w:rPr>
+                <w:color w:val="3A4260"/>
+                <w:sz w:val="19"/>
+              </w:rPr>
+              <w:t>Maquinaria + aduana / transporte</w:t>
+            </w:r>
+          </w:p>
+        </w:tc>
+        <w:tc>
+          <w:tcPr>
+            <w:tcW w:type="dxa" w:w="1531"/>
+          </w:tcPr>
+          <w:p>
+            <w:r>
+              <w:rPr>
+                <w:color w:val="3A4260"/>
+                <w:sz w:val="19"/>
+              </w:rPr>
+              <w:t>48.789 €</w:t>
+            </w:r>
+          </w:p>
+        </w:tc>
+        <w:tc>
+          <w:tcPr>
+            <w:tcW w:type="dxa" w:w="1701"/>
+          </w:tcPr>
+          <w:p>
+            <w:r>
+              <w:rPr>
+                <w:color w:val="3A4260"/>
+                <w:sz w:val="19"/>
+              </w:rPr>
+              <w:t>A confirmar</w:t>
+            </w:r>
+          </w:p>
+        </w:tc>
+        <w:tc>
+          <w:tcPr>
+            <w:tcW w:type="dxa" w:w="1644"/>
+          </w:tcPr>
+          <w:p>
+            <w:r>
+              <w:rPr>
+                <w:color w:val="3A4260"/>
+                <w:sz w:val="19"/>
+              </w:rPr>
+              <w:t>A confirmar</w:t>
+            </w:r>
+          </w:p>
+        </w:tc>
+      </w:tr>
+      <w:tr>
+        <w:tc>
+          <w:tcPr>
+            <w:tcW w:type="dxa" w:w="3402"/>
+          </w:tcPr>
+          <w:p>
+            <w:r>
+              <w:rPr>
+                <w:color w:val="3A4260"/>
+                <w:sz w:val="19"/>
+              </w:rPr>
+              <w:t>Ingeniero</w:t>
+            </w:r>
+          </w:p>
+        </w:tc>
+        <w:tc>
+          <w:tcPr>
+            <w:tcW w:type="dxa" w:w="1531"/>
+          </w:tcPr>
+          <w:p>
+            <w:r>
+              <w:rPr>
+                <w:color w:val="3A4260"/>
+                <w:sz w:val="19"/>
+              </w:rPr>
+              <w:t>7.000 €</w:t>
+            </w:r>
+          </w:p>
+        </w:tc>
+        <w:tc>
+          <w:tcPr>
+            <w:tcW w:type="dxa" w:w="1701"/>
+          </w:tcPr>
+          <w:p>
+            <w:r>
+              <w:rPr>
+                <w:color w:val="3A4260"/>
+                <w:sz w:val="19"/>
+              </w:rPr>
+              <w:t>A confirmar</w:t>
+            </w:r>
+          </w:p>
+        </w:tc>
+        <w:tc>
+          <w:tcPr>
+            <w:tcW w:type="dxa" w:w="1644"/>
+          </w:tcPr>
+          <w:p>
+            <w:r>
+              <w:rPr>
+                <w:color w:val="3A4260"/>
+                <w:sz w:val="19"/>
+              </w:rPr>
+              <w:t>Pendiente</w:t>
+            </w:r>
+          </w:p>
+        </w:tc>
+      </w:tr>
+      <w:tr>
+        <w:tc>
+          <w:tcPr>
+            <w:tcW w:type="dxa" w:w="3402"/>
+          </w:tcPr>
+          <w:p>
+            <w:r>
+              <w:rPr>
+                <w:color w:val="3A4260"/>
+                <w:sz w:val="19"/>
+              </w:rPr>
+              <w:t>PCI / extintores / mangueras</w:t>
+            </w:r>
+          </w:p>
+        </w:tc>
+        <w:tc>
+          <w:tcPr>
+            <w:tcW w:type="dxa" w:w="1531"/>
+          </w:tcPr>
+          <w:p>
+            <w:r>
+              <w:rPr>
+                <w:color w:val="3A4260"/>
+                <w:sz w:val="19"/>
+              </w:rPr>
+              <w:t>A confirmar</w:t>
+            </w:r>
+          </w:p>
+        </w:tc>
+        <w:tc>
+          <w:tcPr>
+            <w:tcW w:type="dxa" w:w="1701"/>
+          </w:tcPr>
+          <w:p>
+            <w:r>
+              <w:rPr>
+                <w:color w:val="3A4260"/>
+                <w:sz w:val="19"/>
+              </w:rPr>
+              <w:t>A confirmar</w:t>
+            </w:r>
+          </w:p>
+        </w:tc>
+        <w:tc>
+          <w:tcPr>
+            <w:tcW w:type="dxa" w:w="1644"/>
+          </w:tcPr>
+          <w:p>
+            <w:r>
+              <w:rPr>
+                <w:color w:val="3A4260"/>
+                <w:sz w:val="19"/>
+              </w:rPr>
+              <w:t>Pendiente</w:t>
+            </w:r>
+          </w:p>
+        </w:tc>
+      </w:tr>
+    </w:tbl>
+    <w:p>
+      <w:pPr>
+        <w:spacing w:after="200"/>
+      </w:pPr>
+      <w:r>
+        <w:rPr>
+          <w:i/>
+          <w:color w:val="697089"/>
+          <w:sz w:val="18"/>
+        </w:rPr>
+        <w:t>Los importes de obra, climatización, vestuarios, electricidad, suelo y accesos corresponden a los presupuestos ya recabados. El total de estas partidas (315.719 € con Ingeniero) supera ligeramente los 308.720 € de la tabla de inversión pendiente del punto 3, porque aquí se desglosa la detección de incendios por separado y se añade el Ingeniero (7.000 €), no incluido antes. Falta confirmar fechas de vencimiento, qué presupuestos están ya aceptados frente a en negociación, y el importe de PCI/extintores/mangueras.</w:t>
+      </w:r>
+    </w:p>
+    <w:p>
+      <w:pPr>
+        <w:keepNext/>
+        <w:spacing w:before="320" w:after="120"/>
+        <w:pBdr>
+          <w:bottom w:val="single" w:sz="6" w:space="2" w:color="E4E7F0"/>
+        </w:pBdr>
+      </w:pPr>
+      <w:r>
+        <w:rPr>
+          <w:b/>
+          <w:color w:val="12325A"/>
+          <w:sz w:val="26"/>
+        </w:rPr>
+        <w:t>5. Instalaciones y plan de explotación</w:t>
       </w:r>
     </w:p>
     <w:p>
@@ -1073,7 +1783,7 @@
           <w:color w:val="12325A"/>
           <w:sz w:val="26"/>
         </w:rPr>
-        <w:t>5. Modelo de negocio</w:t>
+        <w:t>6. Modelo de negocio</w:t>
       </w:r>
     </w:p>
     <w:p>
@@ -1132,7 +1842,7 @@
           <w:color w:val="12325A"/>
           <w:sz w:val="26"/>
         </w:rPr>
-        <w:t>6. Estructura de personal</w:t>
+        <w:t>7. Estructura de personal</w:t>
       </w:r>
     </w:p>
     <w:p>
@@ -1163,7 +1873,7 @@
           <w:color w:val="12325A"/>
           <w:sz w:val="26"/>
         </w:rPr>
-        <w:t>7. Cuenta de resultados proyectada</w:t>
+        <w:t>8. Cuenta de resultados proyectada</w:t>
       </w:r>
     </w:p>
     <w:tbl>
@@ -1662,7 +2372,7 @@
           <w:color w:val="12325A"/>
           <w:sz w:val="26"/>
         </w:rPr>
-        <w:t>8. Vías para participar en la operación</w:t>
+        <w:t>9. Vías para participar en la operación</w:t>
       </w:r>
     </w:p>
     <w:p>
@@ -1825,7 +2535,7 @@
           <w:color w:val="12325A"/>
           <w:sz w:val="26"/>
         </w:rPr>
-        <w:t>9. Capacidad de repago (vía préstamo)</w:t>
+        <w:t>10. Capacidad de repago (vía préstamo)</w:t>
       </w:r>
     </w:p>
     <w:p>
@@ -2287,7 +2997,7 @@
           <w:color w:val="12325A"/>
           <w:sz w:val="26"/>
         </w:rPr>
-        <w:t>10. Garantías ofrecidas</w:t>
+        <w:t>11. Garantías ofrecidas</w:t>
       </w:r>
     </w:p>
     <w:p>
@@ -2356,7 +3066,7 @@
           <w:color w:val="12325A"/>
           <w:sz w:val="26"/>
         </w:rPr>
-        <w:t>11. Equipo promotor</w:t>
+        <w:t>12. Equipo promotor</w:t>
       </w:r>
     </w:p>
     <w:p>
@@ -2387,7 +3097,7 @@
           <w:color w:val="12325A"/>
           <w:sz w:val="26"/>
         </w:rPr>
-        <w:t>12. Puntos fuertes del proyecto</w:t>
+        <w:t>13. Puntos fuertes del proyecto</w:t>
       </w:r>
     </w:p>
     <w:p>

</xml_diff>

<commit_message>
Calendario de pagos: marcar Carulla y Patrick como aceptados/firmados
</commit_message>
<xml_diff>
--- a/entregables/LEGION_plan_economico_financiero_v1.docx
+++ b/entregables/LEGION_plan_economico_financiero_v1.docx
@@ -1241,7 +1241,7 @@
                 <w:color w:val="3A4260"/>
                 <w:sz w:val="19"/>
               </w:rPr>
-              <w:t>A confirmar</w:t>
+              <w:t>Aceptado (firmado)</w:t>
             </w:r>
           </w:p>
         </w:tc>
@@ -1357,7 +1357,7 @@
                 <w:color w:val="3A4260"/>
                 <w:sz w:val="19"/>
               </w:rPr>
-              <w:t>A confirmar</w:t>
+              <w:t>Aceptado (firmado)</w:t>
             </w:r>
           </w:p>
         </w:tc>

</xml_diff>